<commit_message>
updated assignment 6.2 and added module 7
</commit_message>
<xml_diff>
--- a/module-6/gordon_assignment6_2.docx
+++ b/module-6/gordon_assignment6_2.docx
@@ -18,15 +18,7 @@
           <w:b/>
           <w:bCs/>
         </w:rPr>
-        <w:t xml:space="preserve">Movies: </w:t>
-      </w:r>
-      <w:r>
-        <w:rPr>
-          <w:rFonts w:ascii="Arial" w:hAnsi="Arial" w:cs="Arial"/>
-          <w:b/>
-          <w:bCs/>
-        </w:rPr>
-        <w:t>Table Queries</w:t>
+        <w:t>Movies: Table Queries</w:t>
       </w:r>
     </w:p>
     <w:p>
@@ -141,6 +133,24 @@
         </w:rPr>
         <w:t>/2026</w:t>
       </w:r>
+    </w:p>
+    <w:p>
+      <w:pPr>
+        <w:spacing w:line="480" w:lineRule="auto"/>
+        <w:jc w:val="center"/>
+        <w:rPr>
+          <w:rFonts w:ascii="Arial" w:hAnsi="Arial" w:cs="Arial"/>
+        </w:rPr>
+      </w:pPr>
+      <w:hyperlink r:id="rId4" w:history="1">
+        <w:r>
+          <w:rPr>
+            <w:rStyle w:val="Hyperlink"/>
+            <w:rFonts w:ascii="Arial" w:hAnsi="Arial" w:cs="Arial"/>
+          </w:rPr>
+          <w:t>GitHub Link</w:t>
+        </w:r>
+      </w:hyperlink>
     </w:p>
     <w:p>
       <w:pPr>
@@ -153,6 +163,9 @@
     </w:p>
     <w:p>
       <w:r>
+        <w:rPr>
+          <w:noProof/>
+        </w:rPr>
         <w:lastRenderedPageBreak/>
         <w:drawing>
           <wp:inline distT="0" distB="0" distL="0" distR="0" wp14:anchorId="289B63E7" wp14:editId="6C545FD8">
@@ -170,7 +183,7 @@
                     <pic:cNvPicPr/>
                   </pic:nvPicPr>
                   <pic:blipFill>
-                    <a:blip r:embed="rId4"/>
+                    <a:blip r:embed="rId5"/>
                     <a:stretch>
                       <a:fillRect/>
                     </a:stretch>
@@ -1130,6 +1143,18 @@
       <w:u w:val="single"/>
     </w:rPr>
   </w:style>
+  <w:style w:type="character" w:styleId="UnresolvedMention">
+    <w:name w:val="Unresolved Mention"/>
+    <w:basedOn w:val="DefaultParagraphFont"/>
+    <w:uiPriority w:val="99"/>
+    <w:semiHidden/>
+    <w:unhideWhenUsed/>
+    <w:rsid w:val="006062B3"/>
+    <w:rPr>
+      <w:color w:val="605E5C"/>
+      <w:shd w:val="clear" w:color="auto" w:fill="E1DFDD"/>
+    </w:rPr>
+  </w:style>
 </w:styles>
 </file>
 

</xml_diff>